<commit_message>
Fase 1 de responsive
</commit_message>
<xml_diff>
--- a/assets/plantillas/Plantilla - Emitir.docx
+++ b/assets/plantillas/Plantilla - Emitir.docx
@@ -1,6 +1,6 @@
 
 <file path=word/document.xml><?xml version="1.0" encoding="utf-8"?>
-<w:document xmlns:wpc="http://schemas.microsoft.com/office/word/2010/wordprocessingCanvas" xmlns:cx="http://schemas.microsoft.com/office/drawing/2014/chartex" xmlns:cx1="http://schemas.microsoft.com/office/drawing/2015/9/8/chartex" xmlns:cx2="http://schemas.microsoft.com/office/drawing/2015/10/21/chartex" xmlns:cx3="http://schemas.microsoft.com/office/drawing/2016/5/9/chartex" xmlns:cx4="http://schemas.microsoft.com/office/drawing/2016/5/10/chartex" xmlns:cx5="http://schemas.microsoft.com/office/drawing/2016/5/11/chartex" xmlns:cx6="http://schemas.microsoft.com/office/drawing/2016/5/12/chartex" xmlns:cx7="http://schemas.microsoft.com/office/drawing/2016/5/13/chartex" xmlns:cx8="http://schemas.microsoft.com/office/drawing/2016/5/14/chartex" xmlns:mc="http://schemas.openxmlformats.org/markup-compatibility/2006" xmlns:aink="http://schemas.microsoft.com/office/drawing/2016/ink" xmlns:am3d="http://schemas.microsoft.com/office/drawing/2017/model3d" xmlns:o="urn:schemas-microsoft-com:office:office" xmlns:r="http://schemas.openxmlformats.org/officeDocument/2006/relationships" xmlns:m="http://schemas.openxmlformats.org/officeDocument/2006/math" xmlns:v="urn:schemas-microsoft-com:vml" xmlns:wp14="http://schemas.microsoft.com/office/word/2010/wordprocessingDrawing" xmlns:wp="http://schemas.openxmlformats.org/drawingml/2006/wordprocessingDrawing" xmlns:w10="urn:schemas-microsoft-com:office:word" xmlns:w="http://schemas.openxmlformats.org/wordprocessingml/2006/main" xmlns:w14="http://schemas.microsoft.com/office/word/2010/wordml" xmlns:w15="http://schemas.microsoft.com/office/word/2012/wordml" xmlns:w16cex="http://schemas.microsoft.com/office/word/2018/wordml/cex" xmlns:w16cid="http://schemas.microsoft.com/office/word/2016/wordml/cid" xmlns:w16="http://schemas.microsoft.com/office/word/2018/wordml" xmlns:w16sdtdh="http://schemas.microsoft.com/office/word/2020/wordml/sdtdatahash" xmlns:w16se="http://schemas.microsoft.com/office/word/2015/wordml/symex" xmlns:wpg="http://schemas.microsoft.com/office/word/2010/wordprocessingGroup" xmlns:wpi="http://schemas.microsoft.com/office/word/2010/wordprocessingInk" xmlns:wne="http://schemas.microsoft.com/office/word/2006/wordml" xmlns:wps="http://schemas.microsoft.com/office/word/2010/wordprocessingShape" mc:Ignorable="w14 w15 w16se w16cid w16 w16cex w16sdtdh wp14">
+<w:document xmlns:wpc="http://schemas.microsoft.com/office/word/2010/wordprocessingCanvas" xmlns:cx="http://schemas.microsoft.com/office/drawing/2014/chartex" xmlns:cx1="http://schemas.microsoft.com/office/drawing/2015/9/8/chartex" xmlns:cx2="http://schemas.microsoft.com/office/drawing/2015/10/21/chartex" xmlns:cx3="http://schemas.microsoft.com/office/drawing/2016/5/9/chartex" xmlns:cx4="http://schemas.microsoft.com/office/drawing/2016/5/10/chartex" xmlns:cx5="http://schemas.microsoft.com/office/drawing/2016/5/11/chartex" xmlns:cx6="http://schemas.microsoft.com/office/drawing/2016/5/12/chartex" xmlns:cx7="http://schemas.microsoft.com/office/drawing/2016/5/13/chartex" xmlns:cx8="http://schemas.microsoft.com/office/drawing/2016/5/14/chartex" xmlns:mc="http://schemas.openxmlformats.org/markup-compatibility/2006" xmlns:aink="http://schemas.microsoft.com/office/drawing/2016/ink" xmlns:am3d="http://schemas.microsoft.com/office/drawing/2017/model3d" xmlns:o="urn:schemas-microsoft-com:office:office" xmlns:oel="http://schemas.microsoft.com/office/2019/extlst" xmlns:r="http://schemas.openxmlformats.org/officeDocument/2006/relationships" xmlns:m="http://schemas.openxmlformats.org/officeDocument/2006/math" xmlns:v="urn:schemas-microsoft-com:vml" xmlns:wp14="http://schemas.microsoft.com/office/word/2010/wordprocessingDrawing" xmlns:wp="http://schemas.openxmlformats.org/drawingml/2006/wordprocessingDrawing" xmlns:w10="urn:schemas-microsoft-com:office:word" xmlns:w="http://schemas.openxmlformats.org/wordprocessingml/2006/main" xmlns:w14="http://schemas.microsoft.com/office/word/2010/wordml" xmlns:w15="http://schemas.microsoft.com/office/word/2012/wordml" xmlns:w16cex="http://schemas.microsoft.com/office/word/2018/wordml/cex" xmlns:w16cid="http://schemas.microsoft.com/office/word/2016/wordml/cid" xmlns:w16="http://schemas.microsoft.com/office/word/2018/wordml" xmlns:w16sdtdh="http://schemas.microsoft.com/office/word/2020/wordml/sdtdatahash" xmlns:w16se="http://schemas.microsoft.com/office/word/2015/wordml/symex" xmlns:wpg="http://schemas.microsoft.com/office/word/2010/wordprocessingGroup" xmlns:wpi="http://schemas.microsoft.com/office/word/2010/wordprocessingInk" xmlns:wne="http://schemas.microsoft.com/office/word/2006/wordml" xmlns:wps="http://schemas.microsoft.com/office/word/2010/wordprocessingShape" mc:Ignorable="w14 w15 w16se w16cid w16 w16cex w16sdtdh wp14">
   <w:body>
     <w:p>
       <w:pPr>
@@ -422,7 +422,7 @@
 </file>
 
 <file path=word/endnotes.xml><?xml version="1.0" encoding="utf-8"?>
-<w:endnotes xmlns:wpc="http://schemas.microsoft.com/office/word/2010/wordprocessingCanvas" xmlns:cx="http://schemas.microsoft.com/office/drawing/2014/chartex" xmlns:cx1="http://schemas.microsoft.com/office/drawing/2015/9/8/chartex" xmlns:cx2="http://schemas.microsoft.com/office/drawing/2015/10/21/chartex" xmlns:cx3="http://schemas.microsoft.com/office/drawing/2016/5/9/chartex" xmlns:cx4="http://schemas.microsoft.com/office/drawing/2016/5/10/chartex" xmlns:cx5="http://schemas.microsoft.com/office/drawing/2016/5/11/chartex" xmlns:cx6="http://schemas.microsoft.com/office/drawing/2016/5/12/chartex" xmlns:cx7="http://schemas.microsoft.com/office/drawing/2016/5/13/chartex" xmlns:cx8="http://schemas.microsoft.com/office/drawing/2016/5/14/chartex" xmlns:mc="http://schemas.openxmlformats.org/markup-compatibility/2006" xmlns:aink="http://schemas.microsoft.com/office/drawing/2016/ink" xmlns:am3d="http://schemas.microsoft.com/office/drawing/2017/model3d" xmlns:o="urn:schemas-microsoft-com:office:office" xmlns:r="http://schemas.openxmlformats.org/officeDocument/2006/relationships" xmlns:m="http://schemas.openxmlformats.org/officeDocument/2006/math" xmlns:v="urn:schemas-microsoft-com:vml" xmlns:wp14="http://schemas.microsoft.com/office/word/2010/wordprocessingDrawing" xmlns:wp="http://schemas.openxmlformats.org/drawingml/2006/wordprocessingDrawing" xmlns:w10="urn:schemas-microsoft-com:office:word" xmlns:w="http://schemas.openxmlformats.org/wordprocessingml/2006/main" xmlns:w14="http://schemas.microsoft.com/office/word/2010/wordml" xmlns:w15="http://schemas.microsoft.com/office/word/2012/wordml" xmlns:w16cex="http://schemas.microsoft.com/office/word/2018/wordml/cex" xmlns:w16cid="http://schemas.microsoft.com/office/word/2016/wordml/cid" xmlns:w16="http://schemas.microsoft.com/office/word/2018/wordml" xmlns:w16sdtdh="http://schemas.microsoft.com/office/word/2020/wordml/sdtdatahash" xmlns:w16se="http://schemas.microsoft.com/office/word/2015/wordml/symex" xmlns:wpg="http://schemas.microsoft.com/office/word/2010/wordprocessingGroup" xmlns:wpi="http://schemas.microsoft.com/office/word/2010/wordprocessingInk" xmlns:wne="http://schemas.microsoft.com/office/word/2006/wordml" xmlns:wps="http://schemas.microsoft.com/office/word/2010/wordprocessingShape" mc:Ignorable="w14 w15 w16se w16cid w16 w16cex w16sdtdh wp14">
+<w:endnotes xmlns:wpc="http://schemas.microsoft.com/office/word/2010/wordprocessingCanvas" xmlns:cx="http://schemas.microsoft.com/office/drawing/2014/chartex" xmlns:cx1="http://schemas.microsoft.com/office/drawing/2015/9/8/chartex" xmlns:cx2="http://schemas.microsoft.com/office/drawing/2015/10/21/chartex" xmlns:cx3="http://schemas.microsoft.com/office/drawing/2016/5/9/chartex" xmlns:cx4="http://schemas.microsoft.com/office/drawing/2016/5/10/chartex" xmlns:cx5="http://schemas.microsoft.com/office/drawing/2016/5/11/chartex" xmlns:cx6="http://schemas.microsoft.com/office/drawing/2016/5/12/chartex" xmlns:cx7="http://schemas.microsoft.com/office/drawing/2016/5/13/chartex" xmlns:cx8="http://schemas.microsoft.com/office/drawing/2016/5/14/chartex" xmlns:mc="http://schemas.openxmlformats.org/markup-compatibility/2006" xmlns:aink="http://schemas.microsoft.com/office/drawing/2016/ink" xmlns:am3d="http://schemas.microsoft.com/office/drawing/2017/model3d" xmlns:o="urn:schemas-microsoft-com:office:office" xmlns:oel="http://schemas.microsoft.com/office/2019/extlst" xmlns:r="http://schemas.openxmlformats.org/officeDocument/2006/relationships" xmlns:m="http://schemas.openxmlformats.org/officeDocument/2006/math" xmlns:v="urn:schemas-microsoft-com:vml" xmlns:wp14="http://schemas.microsoft.com/office/word/2010/wordprocessingDrawing" xmlns:wp="http://schemas.openxmlformats.org/drawingml/2006/wordprocessingDrawing" xmlns:w10="urn:schemas-microsoft-com:office:word" xmlns:w="http://schemas.openxmlformats.org/wordprocessingml/2006/main" xmlns:w14="http://schemas.microsoft.com/office/word/2010/wordml" xmlns:w15="http://schemas.microsoft.com/office/word/2012/wordml" xmlns:w16cex="http://schemas.microsoft.com/office/word/2018/wordml/cex" xmlns:w16cid="http://schemas.microsoft.com/office/word/2016/wordml/cid" xmlns:w16="http://schemas.microsoft.com/office/word/2018/wordml" xmlns:w16sdtdh="http://schemas.microsoft.com/office/word/2020/wordml/sdtdatahash" xmlns:w16se="http://schemas.microsoft.com/office/word/2015/wordml/symex" xmlns:wpg="http://schemas.microsoft.com/office/word/2010/wordprocessingGroup" xmlns:wpi="http://schemas.microsoft.com/office/word/2010/wordprocessingInk" xmlns:wne="http://schemas.microsoft.com/office/word/2006/wordml" xmlns:wps="http://schemas.microsoft.com/office/word/2010/wordprocessingShape" mc:Ignorable="w14 w15 w16se w16cid w16 w16cex w16sdtdh wp14">
   <w:endnote w:type="separator" w:id="-1">
     <w:p>
       <w:pPr>
@@ -447,7 +447,7 @@
 </file>
 
 <file path=word/footnotes.xml><?xml version="1.0" encoding="utf-8"?>
-<w:footnotes xmlns:wpc="http://schemas.microsoft.com/office/word/2010/wordprocessingCanvas" xmlns:cx="http://schemas.microsoft.com/office/drawing/2014/chartex" xmlns:cx1="http://schemas.microsoft.com/office/drawing/2015/9/8/chartex" xmlns:cx2="http://schemas.microsoft.com/office/drawing/2015/10/21/chartex" xmlns:cx3="http://schemas.microsoft.com/office/drawing/2016/5/9/chartex" xmlns:cx4="http://schemas.microsoft.com/office/drawing/2016/5/10/chartex" xmlns:cx5="http://schemas.microsoft.com/office/drawing/2016/5/11/chartex" xmlns:cx6="http://schemas.microsoft.com/office/drawing/2016/5/12/chartex" xmlns:cx7="http://schemas.microsoft.com/office/drawing/2016/5/13/chartex" xmlns:cx8="http://schemas.microsoft.com/office/drawing/2016/5/14/chartex" xmlns:mc="http://schemas.openxmlformats.org/markup-compatibility/2006" xmlns:aink="http://schemas.microsoft.com/office/drawing/2016/ink" xmlns:am3d="http://schemas.microsoft.com/office/drawing/2017/model3d" xmlns:o="urn:schemas-microsoft-com:office:office" xmlns:r="http://schemas.openxmlformats.org/officeDocument/2006/relationships" xmlns:m="http://schemas.openxmlformats.org/officeDocument/2006/math" xmlns:v="urn:schemas-microsoft-com:vml" xmlns:wp14="http://schemas.microsoft.com/office/word/2010/wordprocessingDrawing" xmlns:wp="http://schemas.openxmlformats.org/drawingml/2006/wordprocessingDrawing" xmlns:w10="urn:schemas-microsoft-com:office:word" xmlns:w="http://schemas.openxmlformats.org/wordprocessingml/2006/main" xmlns:w14="http://schemas.microsoft.com/office/word/2010/wordml" xmlns:w15="http://schemas.microsoft.com/office/word/2012/wordml" xmlns:w16cex="http://schemas.microsoft.com/office/word/2018/wordml/cex" xmlns:w16cid="http://schemas.microsoft.com/office/word/2016/wordml/cid" xmlns:w16="http://schemas.microsoft.com/office/word/2018/wordml" xmlns:w16sdtdh="http://schemas.microsoft.com/office/word/2020/wordml/sdtdatahash" xmlns:w16se="http://schemas.microsoft.com/office/word/2015/wordml/symex" xmlns:wpg="http://schemas.microsoft.com/office/word/2010/wordprocessingGroup" xmlns:wpi="http://schemas.microsoft.com/office/word/2010/wordprocessingInk" xmlns:wne="http://schemas.microsoft.com/office/word/2006/wordml" xmlns:wps="http://schemas.microsoft.com/office/word/2010/wordprocessingShape" mc:Ignorable="w14 w15 w16se w16cid w16 w16cex w16sdtdh wp14">
+<w:footnotes xmlns:wpc="http://schemas.microsoft.com/office/word/2010/wordprocessingCanvas" xmlns:cx="http://schemas.microsoft.com/office/drawing/2014/chartex" xmlns:cx1="http://schemas.microsoft.com/office/drawing/2015/9/8/chartex" xmlns:cx2="http://schemas.microsoft.com/office/drawing/2015/10/21/chartex" xmlns:cx3="http://schemas.microsoft.com/office/drawing/2016/5/9/chartex" xmlns:cx4="http://schemas.microsoft.com/office/drawing/2016/5/10/chartex" xmlns:cx5="http://schemas.microsoft.com/office/drawing/2016/5/11/chartex" xmlns:cx6="http://schemas.microsoft.com/office/drawing/2016/5/12/chartex" xmlns:cx7="http://schemas.microsoft.com/office/drawing/2016/5/13/chartex" xmlns:cx8="http://schemas.microsoft.com/office/drawing/2016/5/14/chartex" xmlns:mc="http://schemas.openxmlformats.org/markup-compatibility/2006" xmlns:aink="http://schemas.microsoft.com/office/drawing/2016/ink" xmlns:am3d="http://schemas.microsoft.com/office/drawing/2017/model3d" xmlns:o="urn:schemas-microsoft-com:office:office" xmlns:oel="http://schemas.microsoft.com/office/2019/extlst" xmlns:r="http://schemas.openxmlformats.org/officeDocument/2006/relationships" xmlns:m="http://schemas.openxmlformats.org/officeDocument/2006/math" xmlns:v="urn:schemas-microsoft-com:vml" xmlns:wp14="http://schemas.microsoft.com/office/word/2010/wordprocessingDrawing" xmlns:wp="http://schemas.openxmlformats.org/drawingml/2006/wordprocessingDrawing" xmlns:w10="urn:schemas-microsoft-com:office:word" xmlns:w="http://schemas.openxmlformats.org/wordprocessingml/2006/main" xmlns:w14="http://schemas.microsoft.com/office/word/2010/wordml" xmlns:w15="http://schemas.microsoft.com/office/word/2012/wordml" xmlns:w16cex="http://schemas.microsoft.com/office/word/2018/wordml/cex" xmlns:w16cid="http://schemas.microsoft.com/office/word/2016/wordml/cid" xmlns:w16="http://schemas.microsoft.com/office/word/2018/wordml" xmlns:w16sdtdh="http://schemas.microsoft.com/office/word/2020/wordml/sdtdatahash" xmlns:w16se="http://schemas.microsoft.com/office/word/2015/wordml/symex" xmlns:wpg="http://schemas.microsoft.com/office/word/2010/wordprocessingGroup" xmlns:wpi="http://schemas.microsoft.com/office/word/2010/wordprocessingInk" xmlns:wne="http://schemas.microsoft.com/office/word/2006/wordml" xmlns:wps="http://schemas.microsoft.com/office/word/2010/wordprocessingShape" mc:Ignorable="w14 w15 w16se w16cid w16 w16cex w16sdtdh wp14">
   <w:footnote w:type="separator" w:id="-1">
     <w:p>
       <w:pPr>
@@ -472,7 +472,10 @@
 </file>
 
 <file path=word/header1.xml><?xml version="1.0" encoding="utf-8"?>
-<w:hdr xmlns:wpc="http://schemas.microsoft.com/office/word/2010/wordprocessingCanvas" xmlns:cx="http://schemas.microsoft.com/office/drawing/2014/chartex" xmlns:cx1="http://schemas.microsoft.com/office/drawing/2015/9/8/chartex" xmlns:cx2="http://schemas.microsoft.com/office/drawing/2015/10/21/chartex" xmlns:cx3="http://schemas.microsoft.com/office/drawing/2016/5/9/chartex" xmlns:cx4="http://schemas.microsoft.com/office/drawing/2016/5/10/chartex" xmlns:cx5="http://schemas.microsoft.com/office/drawing/2016/5/11/chartex" xmlns:cx6="http://schemas.microsoft.com/office/drawing/2016/5/12/chartex" xmlns:cx7="http://schemas.microsoft.com/office/drawing/2016/5/13/chartex" xmlns:cx8="http://schemas.microsoft.com/office/drawing/2016/5/14/chartex" xmlns:mc="http://schemas.openxmlformats.org/markup-compatibility/2006" xmlns:aink="http://schemas.microsoft.com/office/drawing/2016/ink" xmlns:am3d="http://schemas.microsoft.com/office/drawing/2017/model3d" xmlns:o="urn:schemas-microsoft-com:office:office" xmlns:r="http://schemas.openxmlformats.org/officeDocument/2006/relationships" xmlns:m="http://schemas.openxmlformats.org/officeDocument/2006/math" xmlns:v="urn:schemas-microsoft-com:vml" xmlns:wp14="http://schemas.microsoft.com/office/word/2010/wordprocessingDrawing" xmlns:wp="http://schemas.openxmlformats.org/drawingml/2006/wordprocessingDrawing" xmlns:w10="urn:schemas-microsoft-com:office:word" xmlns:w="http://schemas.openxmlformats.org/wordprocessingml/2006/main" xmlns:w14="http://schemas.microsoft.com/office/word/2010/wordml" xmlns:w15="http://schemas.microsoft.com/office/word/2012/wordml" xmlns:w16cex="http://schemas.microsoft.com/office/word/2018/wordml/cex" xmlns:w16cid="http://schemas.microsoft.com/office/word/2016/wordml/cid" xmlns:w16="http://schemas.microsoft.com/office/word/2018/wordml" xmlns:w16sdtdh="http://schemas.microsoft.com/office/word/2020/wordml/sdtdatahash" xmlns:w16se="http://schemas.microsoft.com/office/word/2015/wordml/symex" xmlns:wpg="http://schemas.microsoft.com/office/word/2010/wordprocessingGroup" xmlns:wpi="http://schemas.microsoft.com/office/word/2010/wordprocessingInk" xmlns:wne="http://schemas.microsoft.com/office/word/2006/wordml" xmlns:wps="http://schemas.microsoft.com/office/word/2010/wordprocessingShape" mc:Ignorable="w14 w15 w16se w16cid w16 w16cex w16sdtdh wp14">
+<w:hdr xmlns:wpc="http://schemas.microsoft.com/office/word/2010/wordprocessingCanvas" xmlns:cx="http://schemas.microsoft.com/office/drawing/2014/chartex" xmlns:cx1="http://schemas.microsoft.com/office/drawing/2015/9/8/chartex" xmlns:cx2="http://schemas.microsoft.com/office/drawing/2015/10/21/chartex" xmlns:cx3="http://schemas.microsoft.com/office/drawing/2016/5/9/chartex" xmlns:cx4="http://schemas.microsoft.com/office/drawing/2016/5/10/chartex" xmlns:cx5="http://schemas.microsoft.com/office/drawing/2016/5/11/chartex" xmlns:cx6="http://schemas.microsoft.com/office/drawing/2016/5/12/chartex" xmlns:cx7="http://schemas.microsoft.com/office/drawing/2016/5/13/chartex" xmlns:cx8="http://schemas.microsoft.com/office/drawing/2016/5/14/chartex" xmlns:mc="http://schemas.openxmlformats.org/markup-compatibility/2006" xmlns:aink="http://schemas.microsoft.com/office/drawing/2016/ink" xmlns:am3d="http://schemas.microsoft.com/office/drawing/2017/model3d" xmlns:o="urn:schemas-microsoft-com:office:office" xmlns:oel="http://schemas.microsoft.com/office/2019/extlst" xmlns:r="http://schemas.openxmlformats.org/officeDocument/2006/relationships" xmlns:m="http://schemas.openxmlformats.org/officeDocument/2006/math" xmlns:v="urn:schemas-microsoft-com:vml" xmlns:wp14="http://schemas.microsoft.com/office/word/2010/wordprocessingDrawing" xmlns:wp="http://schemas.openxmlformats.org/drawingml/2006/wordprocessingDrawing" xmlns:w10="urn:schemas-microsoft-com:office:word" xmlns:w="http://schemas.openxmlformats.org/wordprocessingml/2006/main" xmlns:w14="http://schemas.microsoft.com/office/word/2010/wordml" xmlns:w15="http://schemas.microsoft.com/office/word/2012/wordml" xmlns:w16cex="http://schemas.microsoft.com/office/word/2018/wordml/cex" xmlns:w16cid="http://schemas.microsoft.com/office/word/2016/wordml/cid" xmlns:w16="http://schemas.microsoft.com/office/word/2018/wordml" xmlns:w16sdtdh="http://schemas.microsoft.com/office/word/2020/wordml/sdtdatahash" xmlns:w16se="http://schemas.microsoft.com/office/word/2015/wordml/symex" xmlns:wpg="http://schemas.microsoft.com/office/word/2010/wordprocessingGroup" xmlns:wpi="http://schemas.microsoft.com/office/word/2010/wordprocessingInk" xmlns:wne="http://schemas.microsoft.com/office/word/2006/wordml" xmlns:wps="http://schemas.microsoft.com/office/word/2010/wordprocessingShape" mc:Ignorable="w14 w15 w16se w16cid w16 w16cex w16sdtdh wp14">
+  <w:bookmarkStart w:id="0" w:name="_Hlk155101707"/>
+  <w:bookmarkStart w:id="1" w:name="_Hlk188525821"/>
+  <w:bookmarkStart w:id="2" w:name="_Hlk188525822"/>
   <w:p>
     <w:pPr>
       <w:pStyle w:val="NormalWeb"/>
@@ -480,9 +483,6 @@
       <w:ind w:left="142" w:right="425"/>
       <w:jc w:val="center"/>
     </w:pPr>
-    <w:bookmarkStart w:id="0" w:name="_Hlk155101707"/>
-    <w:bookmarkStart w:id="1" w:name="_Hlk188525821"/>
-    <w:bookmarkStart w:id="2" w:name="_Hlk188525822"/>
     <w:r>
       <w:rPr>
         <w:noProof/>
@@ -620,7 +620,7 @@
                                   <pic:cNvPicPr/>
                                 </pic:nvPicPr>
                                 <pic:blipFill rotWithShape="1">
-                                  <a:blip r:embed="rId1"/>
+                                  <a:blip r:embed="rId2"/>
                                   <a:srcRect l="7610" t="4980" r="8749" b="11800"/>
                                   <a:stretch/>
                                 </pic:blipFill>

</xml_diff>